<commit_message>
docs: reframe completed manual as course edition
- Removed student name/ID/section/date fields from the cover; credited the original author and marked it the completed edition
- Restored Appendix C rubric and Appendix D student-record form to the faculty manual's original blank-template form
- Regenerated the Word file (81 pages, full code listings for all 19 experiments); README structure updated
</commit_message>
<xml_diff>
--- a/Machine_Learning_Lab_Manual_Completed.docx
+++ b/Machine_Learning_Lab_Manual_Completed.docx
@@ -7,16 +7,16 @@
         <w:pStyle w:val="Title"/>
       </w:pPr>
       <w:r>
-        <w:t xml:space="preserve">Machine Learning Laboratory Manual — Completed Report</w:t>
+        <w:t xml:space="preserve">Machine Learning Laboratory Manual — Completed Edition</w:t>
       </w:r>
     </w:p>
-    <w:bookmarkStart w:id="16" w:name="Xa82d1bce1dd57da65c398578e191b45ccada402"/>
+    <w:bookmarkStart w:id="16" w:name="X717b45325f02e2af02f583689585f624c1aed4a"/>
     <w:p>
       <w:pPr>
         <w:pStyle w:val="Heading1"/>
       </w:pPr>
       <w:r>
-        <w:t xml:space="preserve">Machine Learning Laboratory Manual — Completed Report</w:t>
+        <w:t xml:space="preserve">Machine Learning Laboratory Manual — Completed Edition</w:t>
       </w:r>
     </w:p>
     <w:p>
@@ -46,141 +46,17 @@
         </w:rPr>
         <w:t xml:space="preserve">Department of Computer Science &amp; Engineering</w:t>
       </w:r>
+      <w:r>
+        <w:t xml:space="preserve"> </w:t>
+      </w:r>
+      <w:r>
+        <w:rPr>
+          <w:b/>
+          <w:bCs/>
+        </w:rPr>
+        <w:t xml:space="preserve">Machine Learning Lab</w:t>
+      </w:r>
     </w:p>
-    <w:tbl>
-      <w:tblPr>
-        <w:tblStyle w:val="Table"/>
-        <w:tblW w:type="auto" w:w="0"/>
-        <w:tblLook w:firstRow="1" w:lastRow="0" w:firstColumn="0" w:lastColumn="0" w:noHBand="0" w:noVBand="0" w:val="0020"/>
-      </w:tblPr>
-      <w:tblGrid>
-        <w:gridCol w:w="3960"/>
-        <w:gridCol w:w="3960"/>
-      </w:tblGrid>
-      <w:tr>
-        <w:trPr>
-          <w:tblHeader w:val="on"/>
-        </w:trPr>
-        <w:tc>
-          <w:tcPr/>
-          <w:p>
-            <w:pPr>
-              <w:pStyle w:val="Compact"/>
-            </w:pPr>
-            <w:r>
-              <w:t xml:space="preserve">Field</w:t>
-            </w:r>
-          </w:p>
-        </w:tc>
-        <w:tc>
-          <w:tcPr/>
-          <w:p>
-            <w:pPr>
-              <w:pStyle w:val="Compact"/>
-            </w:pPr>
-            <w:r>
-              <w:t xml:space="preserve">Entry</w:t>
-            </w:r>
-          </w:p>
-        </w:tc>
-      </w:tr>
-      <w:tr>
-        <w:tc>
-          <w:tcPr/>
-          <w:p>
-            <w:pPr>
-              <w:pStyle w:val="Compact"/>
-            </w:pPr>
-            <w:r>
-              <w:t xml:space="preserve">Student Name</w:t>
-            </w:r>
-          </w:p>
-        </w:tc>
-        <w:tc>
-          <w:tcPr/>
-          <w:p>
-            <w:pPr>
-              <w:pStyle w:val="Compact"/>
-            </w:pPr>
-            <w:r>
-              <w:t xml:space="preserve">____________________________</w:t>
-            </w:r>
-          </w:p>
-        </w:tc>
-      </w:tr>
-      <w:tr>
-        <w:tc>
-          <w:tcPr/>
-          <w:p>
-            <w:pPr>
-              <w:pStyle w:val="Compact"/>
-            </w:pPr>
-            <w:r>
-              <w:t xml:space="preserve">Student ID</w:t>
-            </w:r>
-          </w:p>
-        </w:tc>
-        <w:tc>
-          <w:tcPr/>
-          <w:p>
-            <w:pPr>
-              <w:pStyle w:val="Compact"/>
-            </w:pPr>
-            <w:r>
-              <w:t xml:space="preserve">____________________________</w:t>
-            </w:r>
-          </w:p>
-        </w:tc>
-      </w:tr>
-      <w:tr>
-        <w:tc>
-          <w:tcPr/>
-          <w:p>
-            <w:pPr>
-              <w:pStyle w:val="Compact"/>
-            </w:pPr>
-            <w:r>
-              <w:t xml:space="preserve">Section</w:t>
-            </w:r>
-          </w:p>
-        </w:tc>
-        <w:tc>
-          <w:tcPr/>
-          <w:p>
-            <w:pPr>
-              <w:pStyle w:val="Compact"/>
-            </w:pPr>
-            <w:r>
-              <w:t xml:space="preserve">____________________________</w:t>
-            </w:r>
-          </w:p>
-        </w:tc>
-      </w:tr>
-      <w:tr>
-        <w:tc>
-          <w:tcPr/>
-          <w:p>
-            <w:pPr>
-              <w:pStyle w:val="Compact"/>
-            </w:pPr>
-            <w:r>
-              <w:t xml:space="preserve">Date</w:t>
-            </w:r>
-          </w:p>
-        </w:tc>
-        <w:tc>
-          <w:tcPr/>
-          <w:p>
-            <w:pPr>
-              <w:pStyle w:val="Compact"/>
-            </w:pPr>
-            <w:r>
-              <w:t xml:space="preserve">____________________________</w:t>
-            </w:r>
-          </w:p>
-        </w:tc>
-      </w:tr>
-    </w:tbl>
     <w:p>
       <w:pPr>
         <w:pStyle w:val="BodyText"/>
@@ -190,7 +66,23 @@
           <w:i/>
           <w:iCs/>
         </w:rPr>
-        <w:t xml:space="preserve">Completed following the laboratory manual format of Dr. Ohidujjaman Tuhin, Dept. of CSE, UIU.</w:t>
+        <w:t xml:space="preserve">Prepared by Dr. Ohidujjaman Tuhin, Associate Professor, Dept. of CSE, UIU</w:t>
+      </w:r>
+      <w:r>
+        <w:t xml:space="preserve"> </w:t>
+      </w:r>
+      <w:r>
+        <w:t xml:space="preserve">—</w:t>
+      </w:r>
+      <w:r>
+        <w:t xml:space="preserve"> </w:t>
+      </w:r>
+      <w:r>
+        <w:rPr>
+          <w:i/>
+          <w:iCs/>
+        </w:rPr>
+        <w:t xml:space="preserve">completed edition with full implementations, executed code, results and viva answers for all 19 experiments.</w:t>
       </w:r>
     </w:p>
     <w:p>
@@ -73080,26 +72972,24 @@
       </w:r>
     </w:p>
     <w:bookmarkEnd w:id="202"/>
-    <w:bookmarkStart w:id="203" w:name="X848ce664fb3ac9ac254cb7cd439853184586763"/>
+    <w:bookmarkStart w:id="203" w:name="appendix-c-suggested-assessment-rubric"/>
     <w:p>
       <w:pPr>
         <w:pStyle w:val="Heading1"/>
       </w:pPr>
       <w:r>
-        <w:t xml:space="preserve">Appendix C: Suggested Assessment Rubric (self-assessment)</w:t>
+        <w:t xml:space="preserve">Appendix C: Suggested Assessment Rubric</w:t>
       </w:r>
     </w:p>
     <w:tbl>
       <w:tblPr>
         <w:tblStyle w:val="Table"/>
-        <w:tblW w:type="pct" w:w="5000"/>
-        <w:tblLayout w:type="fixed"/>
+        <w:tblW w:type="auto" w:w="0"/>
         <w:tblLook w:firstRow="1" w:lastRow="0" w:firstColumn="0" w:lastColumn="0" w:noHBand="0" w:noVBand="0" w:val="0020"/>
       </w:tblPr>
       <w:tblGrid>
-        <w:gridCol w:w="2640"/>
-        <w:gridCol w:w="2640"/>
-        <w:gridCol w:w="2640"/>
+        <w:gridCol w:w="3960"/>
+        <w:gridCol w:w="3960"/>
       </w:tblGrid>
       <w:tr>
         <w:trPr>
@@ -73127,17 +73017,6 @@
             </w:r>
           </w:p>
         </w:tc>
-        <w:tc>
-          <w:tcPr/>
-          <w:p>
-            <w:pPr>
-              <w:pStyle w:val="Compact"/>
-            </w:pPr>
-            <w:r>
-              <w:t xml:space="preserve">Our evidence</w:t>
-            </w:r>
-          </w:p>
-        </w:tc>
       </w:tr>
       <w:tr>
         <w:tc>
@@ -73159,26 +73038,6 @@
             </w:pPr>
             <w:r>
               <w:t xml:space="preserve">10%</w:t>
-            </w:r>
-          </w:p>
-        </w:tc>
-        <w:tc>
-          <w:tcPr/>
-          <w:p>
-            <w:pPr>
-              <w:pStyle w:val="Compact"/>
-            </w:pPr>
-            <w:r>
-              <w:t xml:space="preserve">Step-by-step algorithm blocks in every notebook +</w:t>
-            </w:r>
-            <w:r>
-              <w:t xml:space="preserve"> </w:t>
-            </w:r>
-            <w:r>
-              <w:rPr>
-                <w:rStyle w:val="VerbatimChar"/>
-              </w:rPr>
-              <w:t xml:space="preserve">VIVA_GUIDE.md</w:t>
             </w:r>
           </w:p>
         </w:tc>
@@ -73206,17 +73065,6 @@
             </w:r>
           </w:p>
         </w:tc>
-        <w:tc>
-          <w:tcPr/>
-          <w:p>
-            <w:pPr>
-              <w:pStyle w:val="Compact"/>
-            </w:pPr>
-            <w:r>
-              <w:t xml:space="preserve">19 experiments implemented and executed (0 errors)</w:t>
-            </w:r>
-          </w:p>
-        </w:tc>
       </w:tr>
       <w:tr>
         <w:tc>
@@ -73238,17 +73086,6 @@
             </w:pPr>
             <w:r>
               <w:t xml:space="preserve">15%</w:t>
-            </w:r>
-          </w:p>
-        </w:tc>
-        <w:tc>
-          <w:tcPr/>
-          <w:p>
-            <w:pPr>
-              <w:pStyle w:val="Compact"/>
-            </w:pPr>
-            <w:r>
-              <w:t xml:space="preserve">Documented splits, scaling, leakage avoidance, haversine handling</w:t>
             </w:r>
           </w:p>
         </w:tc>
@@ -73276,17 +73113,6 @@
             </w:r>
           </w:p>
         </w:tc>
-        <w:tc>
-          <w:tcPr/>
-          <w:p>
-            <w:pPr>
-              <w:pStyle w:val="Compact"/>
-            </w:pPr>
-            <w:r>
-              <w:t xml:space="preserve">Appropriate metrics per task; plots and metric tables in each notebook</w:t>
-            </w:r>
-          </w:p>
-        </w:tc>
       </w:tr>
       <w:tr>
         <w:tc>
@@ -73308,17 +73134,6 @@
             </w:pPr>
             <w:r>
               <w:t xml:space="preserve">20%</w:t>
-            </w:r>
-          </w:p>
-        </w:tc>
-        <w:tc>
-          <w:tcPr/>
-          <w:p>
-            <w:pPr>
-              <w:pStyle w:val="Compact"/>
-            </w:pPr>
-            <w:r>
-              <w:t xml:space="preserve">Discussion/limitations sections in every experiment + mini project</w:t>
             </w:r>
           </w:p>
         </w:tc>
@@ -73346,17 +73161,6 @@
             </w:r>
           </w:p>
         </w:tc>
-        <w:tc>
-          <w:tcPr/>
-          <w:p>
-            <w:pPr>
-              <w:pStyle w:val="Compact"/>
-            </w:pPr>
-            <w:r>
-              <w:t xml:space="preserve">This completed manual + PDFs + seeds/datasets committed</w:t>
-            </w:r>
-          </w:p>
-        </w:tc>
       </w:tr>
       <w:tr>
         <w:tc>
@@ -73381,26 +73185,6 @@
             </w:r>
           </w:p>
         </w:tc>
-        <w:tc>
-          <w:tcPr/>
-          <w:p>
-            <w:pPr>
-              <w:pStyle w:val="Compact"/>
-            </w:pPr>
-            <w:r>
-              <w:rPr>
-                <w:rStyle w:val="VerbatimChar"/>
-              </w:rPr>
-              <w:t xml:space="preserve">VIVA_GUIDE.md</w:t>
-            </w:r>
-            <w:r>
-              <w:t xml:space="preserve"> </w:t>
-            </w:r>
-            <w:r>
-              <w:t xml:space="preserve">Q&amp;A + per-experiment viva answers</w:t>
-            </w:r>
-          </w:p>
-        </w:tc>
       </w:tr>
     </w:tbl>
     <w:bookmarkEnd w:id="203"/>
@@ -73416,8 +73200,7 @@
     <w:tbl>
       <w:tblPr>
         <w:tblStyle w:val="Table"/>
-        <w:tblW w:type="pct" w:w="5000"/>
-        <w:tblLayout w:type="fixed"/>
+        <w:tblW w:type="auto" w:w="0"/>
         <w:tblLook w:firstRow="1" w:lastRow="0" w:firstColumn="0" w:lastColumn="0" w:noHBand="0" w:noVBand="0" w:val="0020"/>
       </w:tblPr>
       <w:tblGrid>
@@ -73469,9 +73252,6 @@
             <w:pPr>
               <w:pStyle w:val="Compact"/>
             </w:pPr>
-            <w:r>
-              <w:t xml:space="preserve">____________________________</w:t>
-            </w:r>
           </w:p>
         </w:tc>
       </w:tr>
@@ -73493,9 +73273,6 @@
             <w:pPr>
               <w:pStyle w:val="Compact"/>
             </w:pPr>
-            <w:r>
-              <w:t xml:space="preserve">____________________________</w:t>
-            </w:r>
           </w:p>
         </w:tc>
       </w:tr>
@@ -73517,9 +73294,6 @@
             <w:pPr>
               <w:pStyle w:val="Compact"/>
             </w:pPr>
-            <w:r>
-              <w:t xml:space="preserve">____________________________</w:t>
-            </w:r>
           </w:p>
         </w:tc>
       </w:tr>
@@ -73541,9 +73315,6 @@
             <w:pPr>
               <w:pStyle w:val="Compact"/>
             </w:pPr>
-            <w:r>
-              <w:t xml:space="preserve">1-19 (all algorithms of the assignment list)</w:t>
-            </w:r>
           </w:p>
         </w:tc>
       </w:tr>
@@ -73565,9 +73336,6 @@
             <w:pPr>
               <w:pStyle w:val="Compact"/>
             </w:pPr>
-            <w:r>
-              <w:t xml:space="preserve">____________________________</w:t>
-            </w:r>
           </w:p>
         </w:tc>
       </w:tr>
@@ -73589,9 +73357,6 @@
             <w:pPr>
               <w:pStyle w:val="Compact"/>
             </w:pPr>
-            <w:r>
-              <w:t xml:space="preserve">Mall Customers, USGS earthquakes 2023, Breast Cancer, Heart Disease, California Housing, Digits, Airline Passengers, Wine, DAX 1991-98, Old Faithful, Motorcycle, SMS Spam</w:t>
-            </w:r>
           </w:p>
         </w:tc>
       </w:tr>
@@ -73613,9 +73378,6 @@
             <w:pPr>
               <w:pStyle w:val="Compact"/>
             </w:pPr>
-            <w:r>
-              <w:t xml:space="preserve">scikit-learn 1.9.1, XGBoost 3.4.1, CatBoost 1.2.10, PyTorch 2.14.0, transformers 5.17.0, MiniSom 2.3.6, hmmlearn 0.3.3</w:t>
-            </w:r>
           </w:p>
         </w:tc>
       </w:tr>
@@ -73637,9 +73399,6 @@
             <w:pPr>
               <w:pStyle w:val="Compact"/>
             </w:pPr>
-            <w:r>
-              <w:t xml:space="preserve">K=5; DBSCAN ε=0.03 rad/MinPts=10; HDBSCAN mcs=50; threshold τ=0.80; 150-200 trees/boosting rounds; hidden (128,64)/(64-128-64-10); σ=0.08</w:t>
-            </w:r>
           </w:p>
         </w:tc>
       </w:tr>
@@ -73661,9 +73420,6 @@
             <w:pPr>
               <w:pStyle w:val="Compact"/>
             </w:pPr>
-            <w:r>
-              <w:t xml:space="preserve">42 everywhere</w:t>
-            </w:r>
           </w:p>
         </w:tc>
       </w:tr>
@@ -73685,9 +73441,6 @@
             <w:pPr>
               <w:pStyle w:val="Compact"/>
             </w:pPr>
-            <w:r>
-              <w:t xml:space="preserve">All algorithms implemented and evaluated on real data; best classification AUC 0.871 (AdaBoost), best regression R² 0.803 (CatBoost), LSTM RMSE 44.1 vs RNN 69.9, SMS spam F1 0.959</w:t>
-            </w:r>
           </w:p>
         </w:tc>
       </w:tr>
@@ -73709,9 +73462,6 @@
             <w:pPr>
               <w:pStyle w:val="Compact"/>
             </w:pPr>
-            <w:r>
-              <w:t xml:space="preserve">Model choice must match task and data size; gradient boosting leads tabular regression, ensembles tie on small classification data, density clustering finds real seismic zones without labels, and GRNN’s global bandwidth limits it on discontinuous data</w:t>
-            </w:r>
           </w:p>
         </w:tc>
       </w:tr>
@@ -73733,9 +73483,6 @@
             <w:pPr>
               <w:pStyle w:val="Compact"/>
             </w:pPr>
-            <w:r>
-              <w:t xml:space="preserve">____________________________</w:t>
-            </w:r>
           </w:p>
         </w:tc>
       </w:tr>

</xml_diff>